<commit_message>
Re-organization: start working on PMF conference paper
</commit_message>
<xml_diff>
--- a/doc/ML BOSNa_V2.docx
+++ b/doc/ML BOSNa_V2.docx
@@ -275,165 +275,8 @@
       </w:pPr>
       <w:r>
         <w:rPr>
-          <w:b/>
-          <w:bCs/>
-          <w:szCs w:val="20"/>
-        </w:rPr>
-      </w:r>
-    </w:p>
-    <w:p>
-      <w:pPr>
-        <w:pStyle w:val="MDPI31text"/>
-        <w:spacing w:before="60" w:after="0"/>
-        <w:ind w:left="2608" w:hanging="0"/>
-        <w:rPr>
           <w:color w:val="C9211E"/>
         </w:rPr>
-      </w:pPr>
-      <w:r>
-        <w:rPr>
-          <w:b/>
-          <w:bCs/>
-          <w:color w:val="C9211E"/>
-          <w:szCs w:val="20"/>
-        </w:rPr>
-        <w:t>What are the main findings?</w:t>
-      </w:r>
-    </w:p>
-    <w:p>
-      <w:pPr>
-        <w:pStyle w:val="MDPI31text"/>
-        <w:spacing w:before="60" w:after="0"/>
-        <w:ind w:left="2608" w:hanging="0"/>
-        <w:rPr>
-          <w:b/>
-          <w:b/>
-          <w:bCs/>
-          <w:color w:val="C9211E"/>
-          <w:szCs w:val="20"/>
-        </w:rPr>
-      </w:pPr>
-      <w:r>
-        <w:rPr>
-          <w:b/>
-          <w:bCs/>
-          <w:color w:val="C9211E"/>
-          <w:szCs w:val="20"/>
-        </w:rPr>
-      </w:r>
-    </w:p>
-    <w:p>
-      <w:pPr>
-        <w:pStyle w:val="MDPI31text"/>
-        <w:ind w:left="2608" w:hanging="0"/>
-        <w:rPr>
-          <w:color w:val="C9211E"/>
-        </w:rPr>
-      </w:pPr>
-      <w:r>
-        <w:rPr>
-          <w:color w:val="C9211E"/>
-        </w:rPr>
-        <w:t xml:space="preserve">• </w:t>
-      </w:r>
-      <w:r>
-        <w:rPr>
-          <w:color w:val="C9211E"/>
-        </w:rPr>
-        <w:t>Random Forest and XGBoost outperformed LSTM in monthly streamflow prediction.</w:t>
-        <w:br/>
-        <w:t>• Random Forest shows the most robust generalization on test data.</w:t>
-        <w:br/>
-        <w:t>• The dominance of lagged precipitation and streamflow reflects basin memory effects.</w:t>
-      </w:r>
-    </w:p>
-    <w:p>
-      <w:pPr>
-        <w:pStyle w:val="MDPI31text"/>
-        <w:ind w:left="2608" w:hanging="0"/>
-        <w:rPr>
-          <w:color w:val="C9211E"/>
-        </w:rPr>
-      </w:pPr>
-      <w:r>
-        <w:rPr>
-          <w:color w:val="C9211E"/>
-        </w:rPr>
-      </w:r>
-    </w:p>
-    <w:p>
-      <w:pPr>
-        <w:pStyle w:val="MDPI31text"/>
-        <w:ind w:left="2608" w:hanging="0"/>
-        <w:rPr>
-          <w:color w:val="C9211E"/>
-        </w:rPr>
-      </w:pPr>
-      <w:r>
-        <w:rPr>
-          <w:b/>
-          <w:bCs/>
-          <w:color w:val="C9211E"/>
-          <w:szCs w:val="20"/>
-        </w:rPr>
-        <w:t>What are the implications of the main findings?</w:t>
-      </w:r>
-    </w:p>
-    <w:p>
-      <w:pPr>
-        <w:pStyle w:val="MDPI38bullet"/>
-        <w:numPr>
-          <w:ilvl w:val="0"/>
-          <w:numId w:val="2"/>
-        </w:numPr>
-        <w:rPr>
-          <w:color w:val="C9211E"/>
-        </w:rPr>
-      </w:pPr>
-      <w:r>
-        <w:rPr>
-          <w:color w:val="C9211E"/>
-          <w:szCs w:val="20"/>
-        </w:rPr>
-        <w:t>Tree-based ML models appeared to be most suitable for monthly streamflow forecasting in data-limited basins.</w:t>
-      </w:r>
-    </w:p>
-    <w:p>
-      <w:pPr>
-        <w:pStyle w:val="MDPI38bullet"/>
-        <w:numPr>
-          <w:ilvl w:val="0"/>
-          <w:numId w:val="2"/>
-        </w:numPr>
-        <w:rPr>
-          <w:color w:val="C9211E"/>
-        </w:rPr>
-      </w:pPr>
-      <w:r>
-        <w:rPr>
-          <w:color w:val="C9211E"/>
-          <w:szCs w:val="20"/>
-        </w:rPr>
-        <w:t>Explainable AI validates the physical relevance of main hydro-climatic determinants of streamflow.</w:t>
-      </w:r>
-    </w:p>
-    <w:p>
-      <w:pPr>
-        <w:pStyle w:val="MDPI38bullet"/>
-        <w:numPr>
-          <w:ilvl w:val="0"/>
-          <w:numId w:val="2"/>
-        </w:numPr>
-        <w:rPr>
-          <w:color w:val="C9211E"/>
-        </w:rPr>
-      </w:pPr>
-      <w:r>
-        <w:rPr>
-          <w:color w:val="C9211E"/>
-          <w:szCs w:val="20"/>
-        </w:rPr>
-        <w:t>Reliable ML-based forecasts can support national water management in Bosnia and Herzegovina.</w:t>
       </w:r>
     </w:p>
     <w:p>
@@ -586,7 +429,79 @@
       </w:pPr>
       <w:r>
         <w:rPr/>
-        <w:t>The use of ML techniques for streamflow forecasting has become increasingly common among scientists over the past decade, primarily because of their capability to capture non-linear dynamics and temporal variability in hydrological processes and interacting factors without requiring explicit representation of underlying physical processes [9, 10]. A variety of models have been utilised in streamflow prediction research, with Artificial Neural Networks (ANNs) [11, 12, 11,12,13], Long short- term memory (LSTM) [14, 15, 16], Deep Neural Networks (DNNs) [17, 18], Support Vector Regression (SVR) [19, 19,20], Random Forest (RF) [21, 21,22], Light Gradient Boosting Machine (LGBM) [23, 23,24], and eXtreme Gradient Boosting (XGBoost) [25, 26, 25,26,27], being among the most commonly employed techniques.</w:t>
+        <w:t xml:space="preserve">The use of ML techniques for streamflow forecasting has become increasingly common among scientists over the past decade, primarily because of their capability to capture non-linear dynamics and temporal variability in hydrological processes and interacting factors without requiring explicit representation of underlying physical processes [9, 10]. A variety of models have been utilised in streamflow prediction research, with Artificial Neural Networks (ANNs) [11, 12, 11,12,13], Long short- term memory (LSTM) [14, 15, 16], Deep Neural Networks (DNNs) [17, 18], Support Vector Regression (SVR) [19, 19,20], Random Forest (RF) [21, 21,22], Light Gradient Boosting Machine (LGBM) [23, 23,24], and eXtreme Gradient Boosting (XGBoost) [25, 26, 25,26,27], being among the most commonly employed techniques. </w:t>
+      </w:r>
+      <w:r>
+        <w:rPr>
+          <w:color w:val="FF0000"/>
+        </w:rPr>
+        <w:t>On the other hand, se</w:t>
+      </w:r>
+      <w:r>
+        <w:rPr>
+          <w:color w:val="FF0000"/>
+        </w:rPr>
+        <w:t xml:space="preserve">veral studies have successfully applied </w:t>
+      </w:r>
+      <w:r>
+        <w:rPr>
+          <w:color w:val="FF0000"/>
+        </w:rPr>
+        <w:t xml:space="preserve">alternative </w:t>
+      </w:r>
+      <w:r>
+        <w:rPr>
+          <w:color w:val="FF0000"/>
+        </w:rPr>
+        <w:t xml:space="preserve">HBV- and SWAT-type models </w:t>
+      </w:r>
+      <w:r>
+        <w:rPr>
+          <w:color w:val="FF0000"/>
+        </w:rPr>
+        <w:t>based on physical laws of hydrology simulating water movement step-by-step using explicit equations</w:t>
+      </w:r>
+      <w:r>
+        <w:rPr>
+          <w:color w:val="FF0000"/>
+        </w:rPr>
+        <w:t xml:space="preserve"> for monthly streamflow prediction. </w:t>
+      </w:r>
+      <w:r>
+        <w:rPr>
+          <w:color w:val="FF0000"/>
+        </w:rPr>
+        <w:t>It has been shown particularly useful for simulating stremflows in</w:t>
+      </w:r>
+      <w:r>
+        <w:rPr>
+          <w:color w:val="FF0000"/>
+        </w:rPr>
+        <w:t xml:space="preserve"> </w:t>
+      </w:r>
+      <w:r>
+        <w:rPr>
+          <w:color w:val="FF0000"/>
+        </w:rPr>
+        <w:t xml:space="preserve">various </w:t>
+      </w:r>
+      <w:r>
+        <w:rPr>
+          <w:color w:val="FF0000"/>
+        </w:rPr>
+        <w:t xml:space="preserve">basins </w:t>
+      </w:r>
+      <w:r>
+        <w:rPr>
+          <w:color w:val="FF0000"/>
+        </w:rPr>
+        <w:t>[57-59]</w:t>
+      </w:r>
+      <w:r>
+        <w:rPr>
+          <w:color w:val="FF0000"/>
+        </w:rPr>
+        <w:t>.</w:t>
       </w:r>
     </w:p>
     <w:p>
@@ -1087,9 +1002,258 @@
         <w:rPr>
           <w:lang w:val="en-GB"/>
         </w:rPr>
-        <w:t>To account for hydrological memory and delayed catchment responses, lagged predictor variables were incorporated into the modelling framework. Let (Pt), (Tt), and (Qt) denote precipitation, air temperature, and streamflow at time step (t), respectively. The predictor set comprised lagged precipitation terms at one-, two-, and three-month intervals (Pt-1, Pt-2, Pt-3), lagged temperature terms at one- and two-month intervals (Tt-1, Tt-2), and an autoregressive streamflow term representing previous-month discharge (Qt-1). The autoregressive streamflow term captures short-term persistence in river discharge and is widely used in hydrological forecasting to enhance predictive skill. Lagged features were generated independently for each gauging station and variable, and all observations affected by missing values arising from the lagging procedure were excluded from the training dataset prior to model calibration.</w:t>
+        <w:t xml:space="preserve">To account for hydrological memory and delayed catchment responses, lagged predictor variables were incorporated into the modelling framework </w:t>
+      </w:r>
+      <w:r>
+        <w:rPr>
+          <w:color w:val="C9211E"/>
+          <w:lang w:val="en-GB"/>
+        </w:rPr>
+        <w:t>generating them independently for each station and time step (</w:t>
+      </w:r>
+      <w:r>
+        <w:rPr>
+          <w:i/>
+          <w:iCs/>
+          <w:color w:val="C9211E"/>
+          <w:lang w:val="en-GB"/>
+        </w:rPr>
+        <w:t>t</w:t>
+      </w:r>
+      <w:r>
+        <w:rPr>
+          <w:color w:val="C9211E"/>
+          <w:lang w:val="en-GB"/>
+        </w:rPr>
+        <w:t>)</w:t>
+      </w:r>
+      <w:r>
+        <w:rPr>
+          <w:color w:val="C9211E"/>
+          <w:lang w:val="en-GB"/>
+        </w:rPr>
+        <w:t>.</w:t>
+      </w:r>
+      <w:r>
+        <w:rPr>
+          <w:lang w:val="en-GB"/>
+        </w:rPr>
+        <w:t xml:space="preserve"> Let (Pt), (Tt), and (Qt) denote precipitation, air temperature, and streamflow at time st</w:t>
+      </w:r>
+      <w:r>
+        <w:rPr>
+          <w:lang w:val="en-GB"/>
+        </w:rPr>
+        <w:t>ep</w:t>
+      </w:r>
+      <w:r>
+        <w:rPr>
+          <w:lang w:val="en-GB"/>
+        </w:rPr>
+        <w:t xml:space="preserve">, respectively. The predictor set comprised lagged precipitation terms at one-, two-, and three-month intervals (Pt-1, Pt-2, Pt-3), lagged temperature terms at one- and two-month intervals (Tt-1, Tt-2), and an autoregressive streamflow term representing previous-month discharge (Qt-1). The autoregressive streamflow term captures short-term persistence in river discharge and is widely used in hydrological forecasting to enhance predictive skill. </w:t>
+      </w:r>
+      <w:r>
+        <w:rPr>
+          <w:color w:val="C9211E"/>
+          <w:lang w:val="en-GB"/>
+        </w:rPr>
+        <w:t xml:space="preserve"> Missing values introduced by lagged feature construction were removed using a complete-case approach,</w:t>
+      </w:r>
+      <w:r>
+        <w:rPr>
+          <w:color w:val="C9211E"/>
+          <w:lang w:val="en-GB"/>
+        </w:rPr>
+        <w:t xml:space="preserve"> exclud</w:t>
+      </w:r>
+      <w:r>
+        <w:rPr>
+          <w:color w:val="C9211E"/>
+          <w:lang w:val="en-GB"/>
+        </w:rPr>
+        <w:t>ing them</w:t>
+      </w:r>
+      <w:r>
+        <w:rPr>
+          <w:color w:val="C9211E"/>
+          <w:lang w:val="en-GB"/>
+        </w:rPr>
+        <w:t xml:space="preserve"> from the training dataset prior to model calibration.</w:t>
       </w:r>
       <w:bookmarkEnd w:id="0"/>
+    </w:p>
+    <w:p>
+      <w:pPr>
+        <w:pStyle w:val="MDPI31text"/>
+        <w:ind w:left="2608" w:hanging="0"/>
+        <w:rPr/>
+      </w:pPr>
+      <w:r>
+        <w:rPr/>
+        <w:t>P</w:t>
+      </w:r>
+      <w:r>
+        <w:rPr/>
+        <w:t xml:space="preserve">rior to model training, all datasets were merged into a single time-indexed table, where each row corresponds to a monthly observation and columns represent hydro-meteorological variables from all stations. </w:t>
+      </w:r>
+      <w:r>
+        <w:rPr>
+          <w:color w:val="C9211E"/>
+        </w:rPr>
+        <w:t xml:space="preserve">Missing values in temperature data for the Zenica station (July--December 2017) was filled using climatological monthly means computed across all available years. No additional missing values were present after merging.  </w:t>
+      </w:r>
+    </w:p>
+    <w:p>
+      <w:pPr>
+        <w:pStyle w:val="MDPI31text"/>
+        <w:rPr>
+          <w:color w:val="C9211E"/>
+        </w:rPr>
+      </w:pPr>
+      <w:r>
+        <w:rPr>
+          <w:color w:val="C9211E"/>
+        </w:rPr>
+        <w:t>In the case of LSTM, note that input data are structured as three-dimensional tensors of shape (</w:t>
+      </w:r>
+      <w:r>
+        <w:rPr>
+          <w:i/>
+          <w:iCs/>
+          <w:color w:val="C9211E"/>
+        </w:rPr>
+        <w:t xml:space="preserve">N, </w:t>
+      </w:r>
+      <w:r>
+        <w:rPr>
+          <w:i w:val="false"/>
+          <w:iCs w:val="false"/>
+          <w:color w:val="C9211E"/>
+        </w:rPr>
+        <w:t>1</w:t>
+      </w:r>
+      <w:r>
+        <w:rPr>
+          <w:i/>
+          <w:iCs/>
+          <w:color w:val="C9211E"/>
+        </w:rPr>
+        <w:t>, F</w:t>
+      </w:r>
+      <w:r>
+        <w:rPr>
+          <w:color w:val="C9211E"/>
+        </w:rPr>
+        <w:t xml:space="preserve">), where </w:t>
+      </w:r>
+      <w:r>
+        <w:rPr>
+          <w:i/>
+          <w:iCs/>
+          <w:color w:val="C9211E"/>
+        </w:rPr>
+        <w:t>N</w:t>
+      </w:r>
+      <w:r>
+        <w:rPr>
+          <w:color w:val="C9211E"/>
+        </w:rPr>
+        <w:t xml:space="preserve"> is the number of samples and </w:t>
+      </w:r>
+      <w:r>
+        <w:rPr>
+          <w:i/>
+          <w:iCs/>
+          <w:color w:val="C9211E"/>
+        </w:rPr>
+        <w:t>F</w:t>
+      </w:r>
+      <w:r>
+        <w:rPr>
+          <w:color w:val="C9211E"/>
+        </w:rPr>
+        <w:t xml:space="preserve"> the number of input features. A single </w:t>
+      </w:r>
+      <w:r>
+        <w:rPr>
+          <w:i/>
+          <w:iCs/>
+          <w:color w:val="C9211E"/>
+        </w:rPr>
+        <w:t>timestep</w:t>
+      </w:r>
+      <w:r>
+        <w:rPr>
+          <w:color w:val="C9211E"/>
+        </w:rPr>
+        <w:t xml:space="preserve"> (</w:t>
+      </w:r>
+      <w:r>
+        <w:rPr>
+          <w:i/>
+          <w:iCs/>
+          <w:color w:val="C9211E"/>
+        </w:rPr>
+        <w:t>timesteps=1</w:t>
+      </w:r>
+      <w:r>
+        <w:rPr>
+          <w:color w:val="C9211E"/>
+        </w:rPr>
+        <w:t>) was used, meaning that temporal dependencies were not modeled through sequential input windows, but instead explicitly encoded via lagged features.: lagged precipitation (Pt-1, Pt-2, Pt-3), lagged temperature (Tt-1, Tt-2), and lagged discharge (Qt-1) were included for each station. This approach ensures consistency with the feature representation used in tree-based models while still allowing nonlinear modeling through the LSTM architecture.</w:t>
+      </w:r>
+    </w:p>
+    <w:p>
+      <w:pPr>
+        <w:pStyle w:val="MDPI31text"/>
+        <w:rPr>
+          <w:color w:val="C9211E"/>
+        </w:rPr>
+      </w:pPr>
+      <w:r>
+        <w:rPr>
+          <w:color w:val="C9211E"/>
+        </w:rPr>
+        <w:t xml:space="preserve">No explicit normalization or scaling of input variables was applied </w:t>
+      </w:r>
+      <w:r>
+        <w:rPr>
+          <w:color w:val="C9211E"/>
+        </w:rPr>
+        <w:t>either in the train nor the test phase</w:t>
+      </w:r>
+      <w:r>
+        <w:rPr>
+          <w:color w:val="C9211E"/>
+        </w:rPr>
+        <w:t xml:space="preserve">. While normalization is often recommended for neural networks </w:t>
+      </w:r>
+      <w:r>
+        <w:rPr>
+          <w:color w:val="C9211E"/>
+        </w:rPr>
+        <w:t>such LSTM</w:t>
+      </w:r>
+      <w:r>
+        <w:rPr>
+          <w:color w:val="C9211E"/>
+        </w:rPr>
+        <w:t>, the model was trained directly on raw values to maintain consistency with tree-based models and preserve the physical interpretability of hydrological variables.</w:t>
+      </w:r>
+    </w:p>
+    <w:p>
+      <w:pPr>
+        <w:pStyle w:val="MDPI31text"/>
+        <w:ind w:left="2608" w:hanging="0"/>
+        <w:rPr>
+          <w:color w:val="C9211E"/>
+        </w:rPr>
+      </w:pPr>
+      <w:r>
+        <w:rPr>
+          <w:color w:val="C9211E"/>
+        </w:rPr>
+      </w:r>
     </w:p>
     <w:p>
       <w:pPr>
@@ -1718,8 +1882,40 @@
         <w:rPr/>
       </w:pPr>
       <w:r>
-        <w:rPr/>
-        <w:t>Using the optimized model, one-step-ahead forecasts were generated for the testing period. To re-duce systematic bias, a linear scaling correction was applied. A linear regression model was fitted between predicted and observed streamflow values on the training set:</w:t>
+        <w:rPr>
+          <w:color w:val="C9211E"/>
+        </w:rPr>
+        <w:t xml:space="preserve">Despite achieving reasonable predictive performance, all evaluated models exhibited systematic bias in the magnitude of predicted discharge values, particularly in the form of consistent overestimation or underestimation. This behavior is commonly observed in data-driven hydrological models, which may capture temporal variability well but fail to reproduce absolute magnitudes accurately. </w:t>
+      </w:r>
+      <w:r>
+        <w:rPr/>
+        <w:t>To address this issue, a linear scaling bias correction was applied as a post-processing step.</w:t>
+      </w:r>
+    </w:p>
+    <w:p>
+      <w:pPr>
+        <w:pStyle w:val="MDPI31text"/>
+        <w:rPr/>
+      </w:pPr>
+      <w:r>
+        <w:rPr/>
+        <w:t xml:space="preserve">Using the optimized model, one-step-ahead forecasts were generated for the testing period. </w:t>
+      </w:r>
+      <w:r>
+        <w:rPr/>
+        <w:t>S</w:t>
+      </w:r>
+      <w:r>
+        <w:rPr/>
+        <w:t xml:space="preserve">ystematic bias </w:t>
+      </w:r>
+      <w:r>
+        <w:rPr/>
+        <w:t>is reduced by</w:t>
+      </w:r>
+      <w:r>
+        <w:rPr/>
+        <w:t xml:space="preserve"> a linear scaling correction was applied. A linear regression model was fitted between predicted and observed streamflow values on the training set:</w:t>
       </w:r>
     </w:p>
     <w:p>
@@ -1878,7 +2074,15 @@
       </w:pPr>
       <w:r>
         <w:rPr/>
-        <w:t>The derived correction was subsequently applied to test-period predictions, preserving temporal dynamics while improving distributional consistency. The complete modelling workflow is presented in Figure 2.</w:t>
+        <w:t>The derived correction was subsequen</w:t>
+      </w:r>
+      <w:r>
+        <w:rPr/>
+        <w:t>tly</w:t>
+      </w:r>
+      <w:r>
+        <w:rPr/>
+        <w:t xml:space="preserve"> applied to test-period predictions, preserving temporal dynamics while improving distributional consistency. The complete modelling workflow is presented in Figure 2.</w:t>
       </w:r>
     </w:p>
     <w:p>
@@ -1958,7 +2162,51 @@
       </w:pPr>
       <w:r>
         <w:rPr/>
-        <w:t>Random Forest shows slightly lower training accuracy (NSE = 0.964, KGE = 0.884) than XGBoost but achieves nearly identical performance on the testing dataset (NSE = 0.591, KGE = 0.591) (Table 1). This suggests a more balanced bias–variance trade-off and indicates that Random Forest generalises marginally better to unseen data. The similarity in test performance between Random Forest and XGBoost implies that, for the given feature set and temporal resolution, increased model complexity does not provide substantial gains in predictive skill. The LSTM model performs worst among the evaluated approaches. Training accuracy is moderate (NSE = 0.443), and testing performance remains limited (NSE = 0.445), suggesting the model struggles to learn streamflow dynamics (Table 1). Several factors may contribute to this outcome. First, the dataset consists of monthly-aggregated observations, which may not provide sufficient temporal resolution for LSTM models to exploit long-range dependencies. Second, the relatively small number of training samples compared to the high parameterisation of LSTM networks may hinder stable learning. Finally, the use of a single-step input structure with engineered lag features may reduce the advantage of sequence-based deep learning compared to tree-based methods.</w:t>
+        <w:t xml:space="preserve">Random Forest shows slightly lower training accuracy (NSE = 0.964, KGE = 0.884) than XGBoost but achieves nearly identical performance on the testing dataset (NSE = 0.591, KGE = 0.591) (Table 1). This suggests a more balanced bias–variance trade-off and indicates that Random Forest generalises marginally better to unseen data. The similarity in test performance between Random Forest and XGBoost implies that, for the given feature set and temporal resolution, increased model complexity does not provide substantial gains in predictive skill. </w:t>
+      </w:r>
+    </w:p>
+    <w:p>
+      <w:pPr>
+        <w:pStyle w:val="MDPI31text"/>
+        <w:rPr/>
+      </w:pPr>
+      <w:r>
+        <w:rPr/>
+        <w:t xml:space="preserve">LSTM </w:t>
+      </w:r>
+      <w:r>
+        <w:rPr/>
+        <w:t>performs worst among the evaluated approaches. Training accuracy is moderate (NSE = 0.443), and testing performance remains limited (NSE = 0.445), suggesting the model struggles to learn streamflow dynamics (Table 1). Several factors may contribute to this outcome. First, the dataset consists of monthly-aggregated observations, which may not provide sufficient temporal resolution for LSTM models to exploit long-range dependencies. Second, the relatively small number of training samples compared to the high parameterisation of LSTM networks may hinder stable learning. Finally, the use of a single-step input structure with engineered lag features may reduce the advantage of sequence-based deep learning compared to tree-based methods.</w:t>
+      </w:r>
+      <w:r>
+        <w:rPr>
+          <w:color w:val="C9211E"/>
+        </w:rPr>
+        <w:t xml:space="preserve"> </w:t>
+      </w:r>
+      <w:r>
+        <w:rPr>
+          <w:color w:val="C9211E"/>
+        </w:rPr>
+        <w:t>In particular, its</w:t>
+      </w:r>
+      <w:r>
+        <w:rPr>
+          <w:color w:val="C9211E"/>
+        </w:rPr>
+        <w:t xml:space="preserve"> relatively limited performance </w:t>
+      </w:r>
+      <w:r>
+        <w:rPr>
+          <w:color w:val="C9211E"/>
+        </w:rPr>
+        <w:t>could</w:t>
+      </w:r>
+      <w:r>
+        <w:rPr>
+          <w:color w:val="C9211E"/>
+        </w:rPr>
+        <w:t xml:space="preserve"> be attributed to the chosen input representation, where temporal dependencies are captured through lagged features rather than sequential input windows. As a result, the model does not fully exploit the temporal memory capabilities typically associated with recurrent neural networks. Future work will investigate multi-timestep input sequences to better capture temporal dependencies and fully leverage the capabilities of recurrent neural networks.</w:t>
       </w:r>
     </w:p>
     <w:p>
@@ -3677,7 +3925,7 @@
         <w:rPr/>
         <w:drawing>
           <wp:inline distT="0" distB="0" distL="0" distR="0">
-            <wp:extent cx="3175635" cy="1983105"/>
+            <wp:extent cx="3175635" cy="2199640"/>
             <wp:effectExtent l="0" t="0" r="0" b="0"/>
             <wp:docPr id="23" name="Image5" descr="A graph with red and green squares&#10;&#10;AI-generated content may be incorrect."/>
             <wp:cNvGraphicFramePr>
@@ -3701,7 +3949,7 @@
                   <pic:spPr bwMode="auto">
                     <a:xfrm>
                       <a:off x="0" y="0"/>
-                      <a:ext cx="3175635" cy="1983105"/>
+                      <a:ext cx="3175635" cy="2199640"/>
                     </a:xfrm>
                     <a:prstGeom prst="rect">
                       <a:avLst/>
@@ -3717,7 +3965,7 @@
         <w:rPr/>
         <w:drawing>
           <wp:inline distT="0" distB="0" distL="0" distR="0">
-            <wp:extent cx="3113405" cy="1944370"/>
+            <wp:extent cx="3319780" cy="2176145"/>
             <wp:effectExtent l="0" t="0" r="0" b="0"/>
             <wp:docPr id="24" name="Picture 35" descr="A green and red bar graph&#10;&#10;AI-generated content may be incorrect."/>
             <wp:cNvGraphicFramePr>
@@ -3741,7 +3989,7 @@
                   <pic:spPr bwMode="auto">
                     <a:xfrm>
                       <a:off x="0" y="0"/>
-                      <a:ext cx="3113405" cy="1944370"/>
+                      <a:ext cx="3319780" cy="2176145"/>
                     </a:xfrm>
                     <a:prstGeom prst="rect">
                       <a:avLst/>
@@ -3770,7 +4018,7 @@
         <w:rPr/>
         <w:drawing>
           <wp:inline distT="0" distB="0" distL="0" distR="0">
-            <wp:extent cx="3161030" cy="1804670"/>
+            <wp:extent cx="3371215" cy="1884680"/>
             <wp:effectExtent l="0" t="0" r="0" b="0"/>
             <wp:docPr id="25" name="Picture 36" descr="A green bar graph with white text&#10;&#10;AI-generated content may be incorrect."/>
             <wp:cNvGraphicFramePr>
@@ -3794,7 +4042,7 @@
                   <pic:spPr bwMode="auto">
                     <a:xfrm>
                       <a:off x="0" y="0"/>
-                      <a:ext cx="3161030" cy="1804670"/>
+                      <a:ext cx="3371215" cy="1884680"/>
                     </a:xfrm>
                     <a:prstGeom prst="rect">
                       <a:avLst/>
@@ -4149,6 +4397,38 @@
         <w:t>Addressing these limitations with higher-temporal-resolution data, multi-site modelling, expanded predictor sets, and experimentation with hybrid or physics-informed machine learning architectures is a promising direction for future work and will be essential for fully leveraging machine learning to support climate-resilient water management in the BRB and similar regions.</w:t>
       </w:r>
       <w:bookmarkEnd w:id="2"/>
+      <w:r>
+        <w:rPr>
+          <w:color w:val="FF0000"/>
+          <w:lang w:val="en-GB"/>
+        </w:rPr>
+        <w:t xml:space="preserve"> </w:t>
+      </w:r>
+      <w:r>
+        <w:rPr>
+          <w:color w:val="FF0000"/>
+          <w:lang w:val="en-GB"/>
+        </w:rPr>
+        <w:t>This includes</w:t>
+      </w:r>
+      <w:r>
+        <w:rPr>
+          <w:color w:val="FF0000"/>
+        </w:rPr>
+        <w:t xml:space="preserve"> direct comparisons with conceptual rainfall--runoff mo</w:t>
+      </w:r>
+      <w:r>
+        <w:rPr>
+          <w:color w:val="FF0000"/>
+        </w:rPr>
+        <w:t>dels</w:t>
+      </w:r>
+      <w:r>
+        <w:rPr>
+          <w:color w:val="FF0000"/>
+        </w:rPr>
+        <w:t xml:space="preserve"> to further assess the strengths and limitations of data-driven methods.</w:t>
+      </w:r>
     </w:p>
     <w:p>
       <w:pPr>
@@ -4897,7 +5177,7 @@
         <w:pStyle w:val="MDPI81references"/>
         <w:numPr>
           <w:ilvl w:val="0"/>
-          <w:numId w:val="8"/>
+          <w:numId w:val="7"/>
         </w:numPr>
         <w:ind w:left="425" w:hanging="425"/>
         <w:rPr/>
@@ -7843,9 +8123,116 @@
           <w:t>https://doi.org/10.5194/hess-23-4323-2019</w:t>
         </w:r>
       </w:hyperlink>
-      <w:r>
-        <w:rPr/>
-        <w:t>.</w:t>
+      <w:hyperlink r:id="rId84">
+        <w:r>
+          <w:rPr/>
+          <w:t>.</w:t>
+        </w:r>
+      </w:hyperlink>
+    </w:p>
+    <w:p>
+      <w:pPr>
+        <w:pStyle w:val="MDPI81references"/>
+        <w:numPr>
+          <w:ilvl w:val="0"/>
+          <w:numId w:val="1"/>
+        </w:numPr>
+        <w:ind w:left="425" w:hanging="425"/>
+        <w:rPr/>
+      </w:pPr>
+      <w:r>
+        <w:rPr/>
+        <w:t xml:space="preserve">Krysanova, V., &amp; Arnold, J. G. (2008). Advances in ecohydrological modelling with SWAT—a review. </w:t>
+      </w:r>
+      <w:r>
+        <w:rPr>
+          <w:i/>
+        </w:rPr>
+        <w:t>Hydrological Sciences Journal</w:t>
+      </w:r>
+      <w:r>
+        <w:rPr/>
+        <w:t xml:space="preserve">, </w:t>
+      </w:r>
+      <w:r>
+        <w:rPr>
+          <w:i/>
+        </w:rPr>
+        <w:t>53</w:t>
+      </w:r>
+      <w:r>
+        <w:rPr/>
+        <w:t>(5), 939-947.</w:t>
+      </w:r>
+    </w:p>
+    <w:p>
+      <w:pPr>
+        <w:pStyle w:val="MDPI81references"/>
+        <w:numPr>
+          <w:ilvl w:val="0"/>
+          <w:numId w:val="1"/>
+        </w:numPr>
+        <w:ind w:left="425" w:hanging="425"/>
+        <w:rPr/>
+      </w:pPr>
+      <w:r>
+        <w:rPr/>
+        <w:t xml:space="preserve">Bizuneh, B. B., Moges, M. A., Sinshaw, B. G., &amp; Kerebih, M. S. (2021). SWAT and HBV models’ response to streamflow estimation in the upper Blue Nile Basin, Ethiopia. </w:t>
+      </w:r>
+      <w:r>
+        <w:rPr>
+          <w:i/>
+        </w:rPr>
+        <w:t>Water-Energy Nexus</w:t>
+      </w:r>
+      <w:r>
+        <w:rPr/>
+        <w:t xml:space="preserve">, </w:t>
+      </w:r>
+      <w:r>
+        <w:rPr>
+          <w:i/>
+        </w:rPr>
+        <w:t>4</w:t>
+      </w:r>
+      <w:r>
+        <w:rPr/>
+        <w:t>, 41-53.</w:t>
+      </w:r>
+    </w:p>
+    <w:p>
+      <w:pPr>
+        <w:pStyle w:val="MDPI81references"/>
+        <w:numPr>
+          <w:ilvl w:val="0"/>
+          <w:numId w:val="1"/>
+        </w:numPr>
+        <w:ind w:left="425" w:hanging="425"/>
+        <w:rPr/>
+      </w:pPr>
+      <w:r>
+        <w:rPr/>
+        <w:t xml:space="preserve">Simonov, Y. A., Semenova, N. K., &amp; Khristoforov, A. V. (2021). Short-range streamflow forecasting of the Kama River Based on the HBV model application. </w:t>
+      </w:r>
+      <w:r>
+        <w:rPr>
+          <w:i/>
+        </w:rPr>
+        <w:t>Russian Meteorology and Hydrology</w:t>
+      </w:r>
+      <w:r>
+        <w:rPr/>
+        <w:t xml:space="preserve">, </w:t>
+      </w:r>
+      <w:r>
+        <w:rPr>
+          <w:i/>
+        </w:rPr>
+        <w:t>46</w:t>
+      </w:r>
+      <w:r>
+        <w:rPr/>
+        <w:t>(6), 388-395.</w:t>
       </w:r>
     </w:p>
     <w:p>
@@ -7874,12 +8261,12 @@
       </w:r>
     </w:p>
     <w:sectPr>
-      <w:headerReference w:type="even" r:id="rId84"/>
-      <w:headerReference w:type="default" r:id="rId85"/>
-      <w:headerReference w:type="first" r:id="rId86"/>
-      <w:footerReference w:type="even" r:id="rId87"/>
-      <w:footerReference w:type="default" r:id="rId88"/>
-      <w:footerReference w:type="first" r:id="rId89"/>
+      <w:headerReference w:type="even" r:id="rId85"/>
+      <w:headerReference w:type="default" r:id="rId86"/>
+      <w:headerReference w:type="first" r:id="rId87"/>
+      <w:footerReference w:type="even" r:id="rId88"/>
+      <w:footerReference w:type="default" r:id="rId89"/>
+      <w:footerReference w:type="first" r:id="rId90"/>
       <w:type w:val="nextPage"/>
       <w:pgSz w:w="11906" w:h="16838"/>
       <w:pgMar w:left="720" w:right="720" w:gutter="0" w:header="720" w:top="1417" w:footer="612" w:bottom="907"/>
@@ -8124,7 +8511,7 @@
       <w:rPr>
         <w:sz w:val="16"/>
       </w:rPr>
-      <w:t>22</w:t>
+      <w:t>23</w:t>
     </w:r>
     <w:r>
       <w:rPr>
@@ -8160,7 +8547,7 @@
       <w:rPr>
         <w:sz w:val="16"/>
       </w:rPr>
-      <w:t>22</w:t>
+      <w:t>23</w:t>
     </w:r>
     <w:r>
       <w:rPr>
@@ -8646,133 +9033,6 @@
   <w:abstractNum w:abstractNumId="3">
     <w:lvl w:ilvl="0">
       <w:start w:val="1"/>
-      <w:numFmt w:val="bullet"/>
-      <w:lvlText w:val=""/>
-      <w:lvlJc w:val="left"/>
-      <w:pPr>
-        <w:tabs>
-          <w:tab w:val="num" w:pos="0"/>
-        </w:tabs>
-        <w:ind w:left="3033" w:hanging="425"/>
-      </w:pPr>
-      <w:rPr>
-        <w:rFonts w:ascii="Symbol" w:hAnsi="Symbol" w:cs="Symbol" w:hint="default"/>
-        <w:vertAlign w:val="baseline"/>
-        <w:position w:val="0"/>
-        <w:sz w:val="20"/>
-        <w:sz w:val="20"/>
-        <w:i w:val="false"/>
-        <w:b w:val="false"/>
-      </w:rPr>
-    </w:lvl>
-    <w:lvl w:ilvl="1">
-      <w:start w:val="1"/>
-      <w:numFmt w:val="lowerLetter"/>
-      <w:lvlText w:val="%2."/>
-      <w:lvlJc w:val="left"/>
-      <w:pPr>
-        <w:tabs>
-          <w:tab w:val="num" w:pos="0"/>
-        </w:tabs>
-        <w:ind w:left="1440" w:hanging="360"/>
-      </w:pPr>
-      <w:rPr/>
-    </w:lvl>
-    <w:lvl w:ilvl="2">
-      <w:start w:val="1"/>
-      <w:numFmt w:val="lowerRoman"/>
-      <w:lvlText w:val="%3."/>
-      <w:lvlJc w:val="right"/>
-      <w:pPr>
-        <w:tabs>
-          <w:tab w:val="num" w:pos="0"/>
-        </w:tabs>
-        <w:ind w:left="2160" w:hanging="180"/>
-      </w:pPr>
-      <w:rPr/>
-    </w:lvl>
-    <w:lvl w:ilvl="3">
-      <w:start w:val="1"/>
-      <w:numFmt w:val="decimal"/>
-      <w:lvlText w:val="%4."/>
-      <w:lvlJc w:val="left"/>
-      <w:pPr>
-        <w:tabs>
-          <w:tab w:val="num" w:pos="0"/>
-        </w:tabs>
-        <w:ind w:left="2880" w:hanging="360"/>
-      </w:pPr>
-      <w:rPr/>
-    </w:lvl>
-    <w:lvl w:ilvl="4">
-      <w:start w:val="1"/>
-      <w:numFmt w:val="lowerLetter"/>
-      <w:lvlText w:val="%5."/>
-      <w:lvlJc w:val="left"/>
-      <w:pPr>
-        <w:tabs>
-          <w:tab w:val="num" w:pos="0"/>
-        </w:tabs>
-        <w:ind w:left="3600" w:hanging="360"/>
-      </w:pPr>
-      <w:rPr/>
-    </w:lvl>
-    <w:lvl w:ilvl="5">
-      <w:start w:val="1"/>
-      <w:numFmt w:val="lowerRoman"/>
-      <w:lvlText w:val="%6."/>
-      <w:lvlJc w:val="right"/>
-      <w:pPr>
-        <w:tabs>
-          <w:tab w:val="num" w:pos="0"/>
-        </w:tabs>
-        <w:ind w:left="4320" w:hanging="180"/>
-      </w:pPr>
-      <w:rPr/>
-    </w:lvl>
-    <w:lvl w:ilvl="6">
-      <w:start w:val="1"/>
-      <w:numFmt w:val="decimal"/>
-      <w:lvlText w:val="%7."/>
-      <w:lvlJc w:val="left"/>
-      <w:pPr>
-        <w:tabs>
-          <w:tab w:val="num" w:pos="0"/>
-        </w:tabs>
-        <w:ind w:left="5040" w:hanging="360"/>
-      </w:pPr>
-      <w:rPr/>
-    </w:lvl>
-    <w:lvl w:ilvl="7">
-      <w:start w:val="1"/>
-      <w:numFmt w:val="lowerLetter"/>
-      <w:lvlText w:val="%8."/>
-      <w:lvlJc w:val="left"/>
-      <w:pPr>
-        <w:tabs>
-          <w:tab w:val="num" w:pos="0"/>
-        </w:tabs>
-        <w:ind w:left="5760" w:hanging="360"/>
-      </w:pPr>
-      <w:rPr/>
-    </w:lvl>
-    <w:lvl w:ilvl="8">
-      <w:start w:val="1"/>
-      <w:numFmt w:val="lowerRoman"/>
-      <w:lvlText w:val="%9."/>
-      <w:lvlJc w:val="right"/>
-      <w:pPr>
-        <w:tabs>
-          <w:tab w:val="num" w:pos="0"/>
-        </w:tabs>
-        <w:ind w:left="6480" w:hanging="180"/>
-      </w:pPr>
-      <w:rPr/>
-    </w:lvl>
-  </w:abstractNum>
-  <w:abstractNum w:abstractNumId="4">
-    <w:lvl w:ilvl="0">
-      <w:start w:val="1"/>
       <w:numFmt w:val="decimal"/>
       <w:lvlText w:val="%1."/>
       <w:lvlJc w:val="left"/>
@@ -8891,7 +9151,7 @@
       <w:rPr/>
     </w:lvl>
   </w:abstractNum>
-  <w:abstractNum w:abstractNumId="5">
+  <w:abstractNum w:abstractNumId="4">
     <w:lvl w:ilvl="0">
       <w:start w:val="1"/>
       <w:numFmt w:val="decimal"/>
@@ -9017,7 +9277,7 @@
       <w:rPr/>
     </w:lvl>
   </w:abstractNum>
-  <w:abstractNum w:abstractNumId="6">
+  <w:abstractNum w:abstractNumId="5">
     <w:lvl w:ilvl="0">
       <w:start w:val="1"/>
       <w:numFmt w:val="decimal"/>
@@ -9143,9 +9403,10 @@
       <w:rPr/>
     </w:lvl>
   </w:abstractNum>
-  <w:abstractNum w:abstractNumId="7">
+  <w:abstractNum w:abstractNumId="6">
     <w:lvl w:ilvl="0">
       <w:start w:val="1"/>
+      <w:pStyle w:val="Heading1"/>
       <w:numFmt w:val="none"/>
       <w:suff w:val="nothing"/>
       <w:lvlText w:val=""/>
@@ -9172,6 +9433,7 @@
     </w:lvl>
     <w:lvl w:ilvl="2">
       <w:start w:val="1"/>
+      <w:pStyle w:val="Heading3"/>
       <w:numFmt w:val="none"/>
       <w:suff w:val="nothing"/>
       <w:lvlText w:val=""/>
@@ -9281,9 +9543,6 @@
     <w:abstractNumId w:val="6"/>
   </w:num>
   <w:num w:numId="7">
-    <w:abstractNumId w:val="7"/>
-  </w:num>
-  <w:num w:numId="8">
     <w:abstractNumId w:val="1"/>
     <w:lvlOverride w:ilvl="0">
       <w:startOverride w:val="1"/>
@@ -9705,6 +9964,40 @@
       <w:lang w:val="en-US" w:eastAsia="zh-CN" w:bidi="ar-SA"/>
     </w:rPr>
   </w:style>
+  <w:style w:type="paragraph" w:styleId="Heading1">
+    <w:name w:val="Heading 1"/>
+    <w:basedOn w:val="Heading"/>
+    <w:next w:val="TextBody"/>
+    <w:qFormat/>
+    <w:pPr>
+      <w:spacing w:before="240" w:after="120"/>
+      <w:outlineLvl w:val="0"/>
+    </w:pPr>
+    <w:rPr>
+      <w:rFonts w:ascii="Liberation Serif" w:hAnsi="Liberation Serif" w:eastAsia="Noto Serif CJK SC" w:cs="DejaVu Sans"/>
+      <w:b/>
+      <w:bCs/>
+      <w:sz w:val="48"/>
+      <w:szCs w:val="48"/>
+    </w:rPr>
+  </w:style>
+  <w:style w:type="paragraph" w:styleId="Heading3">
+    <w:name w:val="Heading 3"/>
+    <w:basedOn w:val="Heading"/>
+    <w:next w:val="TextBody"/>
+    <w:qFormat/>
+    <w:pPr>
+      <w:spacing w:before="140" w:after="120"/>
+      <w:outlineLvl w:val="2"/>
+    </w:pPr>
+    <w:rPr>
+      <w:rFonts w:ascii="Liberation Serif" w:hAnsi="Liberation Serif" w:eastAsia="Noto Serif CJK SC" w:cs="DejaVu Sans"/>
+      <w:b/>
+      <w:bCs/>
+      <w:sz w:val="28"/>
+      <w:szCs w:val="28"/>
+    </w:rPr>
+  </w:style>
   <w:style w:type="character" w:styleId="DefaultParagraphFont" w:default="1">
     <w:name w:val="Default Paragraph Font"/>
     <w:uiPriority w:val="1"/>
@@ -9902,6 +10195,21 @@
   <w:style w:type="character" w:styleId="LineNumbering">
     <w:name w:val="Line Numbering"/>
     <w:rPr/>
+  </w:style>
+  <w:style w:type="character" w:styleId="Bullets">
+    <w:name w:val="Bullets"/>
+    <w:qFormat/>
+    <w:rPr>
+      <w:rFonts w:ascii="OpenSymbol" w:hAnsi="OpenSymbol" w:eastAsia="OpenSymbol" w:cs="OpenSymbol"/>
+    </w:rPr>
+  </w:style>
+  <w:style w:type="character" w:styleId="StrongEmphasis">
+    <w:name w:val="Strong Emphasis"/>
+    <w:qFormat/>
+    <w:rPr>
+      <w:b/>
+      <w:bCs/>
+    </w:rPr>
   </w:style>
   <w:style w:type="paragraph" w:styleId="Heading">
     <w:name w:val="Heading"/>
@@ -10298,7 +10606,7 @@
       <w:widowControl/>
       <w:numPr>
         <w:ilvl w:val="0"/>
-        <w:numId w:val="5"/>
+        <w:numId w:val="4"/>
       </w:numPr>
       <w:bidi w:val="0"/>
       <w:snapToGrid w:val="false"/>
@@ -10322,7 +10630,7 @@
       <w:widowControl/>
       <w:numPr>
         <w:ilvl w:val="0"/>
-        <w:numId w:val="3"/>
+        <w:numId w:val="2"/>
       </w:numPr>
       <w:bidi w:val="0"/>
       <w:snapToGrid w:val="false"/>
@@ -10558,7 +10866,7 @@
       <w:widowControl/>
       <w:numPr>
         <w:ilvl w:val="0"/>
-        <w:numId w:val="6"/>
+        <w:numId w:val="5"/>
       </w:numPr>
       <w:bidi w:val="0"/>
       <w:snapToGrid w:val="false"/>
@@ -10882,7 +11190,7 @@
       <w:widowControl/>
       <w:numPr>
         <w:ilvl w:val="0"/>
-        <w:numId w:val="4"/>
+        <w:numId w:val="3"/>
       </w:numPr>
       <w:bidi w:val="0"/>
       <w:snapToGrid w:val="false"/>
@@ -10917,6 +11225,36 @@
     <w:qFormat/>
     <w:pPr/>
     <w:rPr/>
+  </w:style>
+  <w:style w:type="paragraph" w:styleId="PreformattedText">
+    <w:name w:val="Preformatted Text"/>
+    <w:basedOn w:val="Normal"/>
+    <w:qFormat/>
+    <w:pPr>
+      <w:spacing w:before="0" w:after="0"/>
+    </w:pPr>
+    <w:rPr>
+      <w:rFonts w:ascii="Liberation Mono" w:hAnsi="Liberation Mono" w:eastAsia="Noto Sans Mono CJK SC" w:cs="Liberation Mono"/>
+      <w:sz w:val="20"/>
+      <w:szCs w:val="20"/>
+    </w:rPr>
+  </w:style>
+  <w:style w:type="paragraph" w:styleId="HorizontalLine">
+    <w:name w:val="Horizontal Line"/>
+    <w:basedOn w:val="Normal"/>
+    <w:next w:val="TextBody"/>
+    <w:qFormat/>
+    <w:pPr>
+      <w:suppressLineNumbers/>
+      <w:pBdr>
+        <w:bottom w:val="double" w:sz="2" w:space="0" w:color="808080"/>
+      </w:pBdr>
+      <w:spacing w:before="0" w:after="283"/>
+    </w:pPr>
+    <w:rPr>
+      <w:sz w:val="12"/>
+      <w:szCs w:val="12"/>
+    </w:rPr>
   </w:style>
   <w:style w:type="numbering" w:styleId="NoList" w:default="1">
     <w:name w:val="No List"/>

</xml_diff>